<commit_message>
Normalize Profound memo typography
</commit_message>
<xml_diff>
--- a/sba_application/21_profound_ads_partnership_2026-08-06/Profound Counsel Memorandum - Working Draft Revision 1.00 - 080626.docx
+++ b/sba_application/21_profound_ads_partnership_2026-08-06/Profound Counsel Memorandum - Working Draft Revision 1.00 - 080626.docx
@@ -53,6 +53,9 @@
       <w:r>
         <w:rPr>
           <w:rFonts w:ascii="Times New Roman" w:hAnsi="Times New Roman"/>
+          <w:b/>
+          <w:color w:val="000000"/>
+          <w:sz w:val="28"/>
         </w:rPr>
         <w:t>COUNSEL MEMORANDUM</w:t>
       </w:r>
@@ -341,7 +344,7 @@
           <w:rFonts w:ascii="Times New Roman" w:hAnsi="Times New Roman" w:eastAsia="Times New Roman" w:cs="Times New Roman"/>
           <w:b/>
           <w:color w:val="000000"/>
-          <w:sz w:val="22"/>
+          <w:sz w:val="21"/>
         </w:rPr>
         <w:t>2.1 Profound’s role as provider of record</w:t>
       </w:r>
@@ -507,7 +510,7 @@
           <w:rFonts w:ascii="Times New Roman" w:hAnsi="Times New Roman" w:eastAsia="Times New Roman" w:cs="Times New Roman"/>
           <w:b/>
           <w:color w:val="000000"/>
-          <w:sz w:val="22"/>
+          <w:sz w:val="21"/>
         </w:rPr>
         <w:t>2.2 Azalea’s role</w:t>
       </w:r>
@@ -726,7 +729,7 @@
           <w:rFonts w:ascii="Times New Roman" w:hAnsi="Times New Roman" w:eastAsia="Times New Roman" w:cs="Times New Roman"/>
           <w:b/>
           <w:color w:val="000000"/>
-          <w:sz w:val="22"/>
+          <w:sz w:val="21"/>
         </w:rPr>
         <w:t>4.1 Fixed fee and direct costs</w:t>
       </w:r>
@@ -788,7 +791,7 @@
           <w:rFonts w:ascii="Times New Roman" w:hAnsi="Times New Roman" w:eastAsia="Times New Roman" w:cs="Times New Roman"/>
           <w:b/>
           <w:color w:val="000000"/>
-          <w:sz w:val="22"/>
+          <w:sz w:val="21"/>
         </w:rPr>
         <w:t>4.2 Transition consideration—Patrick’s election</w:t>
       </w:r>
@@ -1222,11 +1225,14 @@
         <w:pStyle w:val="Heading2"/>
         <w:keepNext/>
         <w:pageBreakBefore/>
-        <w:spacing w:before="140" w:after="60"/>
+        <w:spacing w:before="140" w:after="60" w:line="240" w:lineRule="auto"/>
       </w:pPr>
       <w:r>
         <w:rPr>
           <w:rFonts w:ascii="Times New Roman" w:hAnsi="Times New Roman"/>
+          <w:b/>
+          <w:color w:val="000000"/>
+          <w:sz w:val="21"/>
         </w:rPr>
         <w:t>7.1 ADS go/no-go approval matrix</w:t>
       </w:r>
@@ -3059,6 +3065,9 @@
       <w:r>
         <w:rPr>
           <w:rFonts w:ascii="Times New Roman" w:hAnsi="Times New Roman"/>
+          <w:b/>
+          <w:color w:val="000000"/>
+          <w:sz w:val="24"/>
         </w:rPr>
         <w:t>Appendix A. Selected primary authorities for counsel’s review</w:t>
       </w:r>
@@ -3204,10 +3213,14 @@
         <w:pStyle w:val="Heading1"/>
         <w:keepNext/>
         <w:pageBreakBefore/>
+        <w:spacing w:line="252" w:lineRule="auto"/>
       </w:pPr>
       <w:r>
         <w:rPr>
           <w:rFonts w:ascii="Times New Roman" w:hAnsi="Times New Roman"/>
+          <w:b/>
+          <w:color w:val="000000"/>
+          <w:sz w:val="24"/>
         </w:rPr>
         <w:t>Appendix B. Entity structure for drafting</w:t>
       </w:r>
@@ -3328,6 +3341,7 @@
         <w:rPr>
           <w:rFonts w:ascii="Times New Roman" w:hAnsi="Times New Roman"/>
           <w:b/>
+          <w:color w:val="000000"/>
           <w:sz w:val="21"/>
         </w:rPr>
         <w:t>Drafting note.</w:t>
@@ -3336,6 +3350,7 @@
         <w:rPr>
           <w:rFonts w:ascii="Times New Roman" w:hAnsi="Times New Roman"/>
           <w:b w:val="0"/>
+          <w:color w:val="000000"/>
           <w:sz w:val="21"/>
         </w:rPr>
         <w:t xml:space="preserve"> The Tyler operating company has been identified and is currently undergoing diligence, but it does not yet exist as a formed subsidiary. Tyler Hospice Hold, LLC is intended to own 100% of that future subsidiary, and “Azalea Hospice” is the intended DBA/trade name of the operating company—not a separate existing legal entity.</w:t>
@@ -3942,7 +3957,7 @@
       <w:b/>
       <w:bCs/>
       <w:color w:val="000000"/>
-      <w:sz w:val="22"/>
+      <w:sz w:val="21"/>
       <w:szCs w:val="26"/>
     </w:rPr>
   </w:style>

</xml_diff>

<commit_message>
Add confirmed Tyler ADS address
</commit_message>
<xml_diff>
--- a/sba_application/21_profound_ads_partnership_2026-08-06/Profound Counsel Memorandum - Working Draft Revision 1.00 - 080626.docx
+++ b/sba_application/21_profound_ads_partnership_2026-08-06/Profound Counsel Memorandum - Working Draft Revision 1.00 - 080626.docx
@@ -1117,7 +1117,7 @@
           <w:color w:val="000000"/>
           <w:sz w:val="21"/>
         </w:rPr>
-        <w:t>Texas HHSC/TULIP approval of the ADS application, exact address, parent-license relationship, administrator and supervising-nurse structure, and any required license or service-area updates;</w:t>
+        <w:t>Texas HHSC/TULIP approval of the ADS application for 13387 North Highway 69, Tyler, Texas, parent-license relationship, administrator and supervising-nurse structure, and any required license or service-area updates;</w:t>
       </w:r>
     </w:p>
     <w:p>
@@ -1364,7 +1364,7 @@
                 <w:color w:val="000000"/>
                 <w:sz w:val="19"/>
               </w:rPr>
-              <w:t>TULIP approval, issued ADS license, exact Tyler address, parent-license link, service-area confirmation.</w:t>
+              <w:t>TULIP approval and issued ADS license for 13387 North Highway 69, Tyler, Texas, parent-license link, service-area confirmation.</w:t>
             </w:r>
           </w:p>
         </w:tc>

</xml_diff>

<commit_message>
Reformat entity ownership diagrams vertically
</commit_message>
<xml_diff>
--- a/sba_application/21_profound_ads_partnership_2026-08-06/Profound Counsel Memorandum - Working Draft Revision 1.00 - 080626.docx
+++ b/sba_application/21_profound_ads_partnership_2026-08-06/Profound Counsel Memorandum - Working Draft Revision 1.00 - 080626.docx
@@ -3227,106 +3227,154 @@
     </w:p>
     <w:tbl>
       <w:tblPr>
-        <w:tblW w:type="dxa" w:w="11400"/>
+        <w:tblW w:type="dxa" w:w="7416"/>
         <w:jc w:val="center"/>
         <w:tblLayout w:type="fixed"/>
         <w:tblLook w:firstColumn="1" w:firstRow="1" w:lastColumn="0" w:lastRow="0" w:noHBand="0" w:noVBand="1" w:val="04A0"/>
       </w:tblPr>
       <w:tblGrid>
-        <w:gridCol w:w="4200"/>
-        <w:gridCol w:w="2200"/>
-        <w:gridCol w:w="5000"/>
+        <w:gridCol w:w="7416"/>
       </w:tblGrid>
       <w:tr>
+        <w:trPr>
+          <w:trHeight w:val="893" w:hRule="atLeast"/>
+        </w:trPr>
         <w:tc>
           <w:tcPr>
-            <w:tcW w:type="dxa" w:w="3120"/>
+            <w:tcW w:type="dxa" w:w="7416"/>
             <w:vAlign w:val="center"/>
+            <w:tcBorders>
+              <w:top w:val="single" w:sz="10" w:color="444444"/>
+              <w:left w:val="single" w:sz="10" w:color="444444"/>
+              <w:bottom w:val="single" w:sz="10" w:color="444444"/>
+              <w:right w:val="single" w:sz="10" w:color="444444"/>
+              <w:insideH w:val="single" w:sz="10" w:color="444444"/>
+              <w:insideV w:val="single" w:sz="10" w:color="444444"/>
+            </w:tcBorders>
             <w:shd w:fill="F2F2F2"/>
-            <w:tcBorders>
-              <w:top w:val="single" w:sz="8" w:space="0" w:color="000000"/>
-              <w:left w:val="single" w:sz="8" w:space="0" w:color="000000"/>
-              <w:bottom w:val="single" w:sz="8" w:space="0" w:color="000000"/>
-              <w:right w:val="single" w:sz="8" w:space="0" w:color="000000"/>
-            </w:tcBorders>
           </w:tcPr>
           <w:p>
             <w:pPr>
-              <w:spacing w:before="80" w:after="80"/>
+              <w:spacing w:before="80" w:after="80" w:line="240" w:lineRule="auto"/>
               <w:jc w:val="center"/>
             </w:pPr>
             <w:r>
               <w:rPr>
-                <w:rFonts w:ascii="Times New Roman" w:hAnsi="Times New Roman" w:eastAsia="Times New Roman"/>
+                <w:rFonts w:ascii="Times New Roman" w:hAnsi="Times New Roman"/>
                 <w:b/>
                 <w:color w:val="000000"/>
-                <w:sz w:val="20"/>
+                <w:sz w:val="21"/>
               </w:rPr>
               <w:t>Tyler Hospice Hold, LLC</w:t>
               <w:br/>
+            </w:r>
+            <w:r>
+              <w:rPr>
+                <w:rFonts w:ascii="Times New Roman" w:hAnsi="Times New Roman"/>
+                <w:b w:val="0"/>
+                <w:color w:val="000000"/>
+                <w:sz w:val="19"/>
+              </w:rPr>
               <w:t>Holding company</w:t>
             </w:r>
           </w:p>
         </w:tc>
+      </w:tr>
+      <w:tr>
+        <w:trPr>
+          <w:trHeight w:val="893" w:hRule="atLeast"/>
+        </w:trPr>
         <w:tc>
           <w:tcPr>
-            <w:tcW w:type="dxa" w:w="3120"/>
+            <w:tcW w:type="dxa" w:w="7416"/>
             <w:vAlign w:val="center"/>
             <w:tcBorders>
-              <w:top w:val="nil" w:sz="8" w:space="0" w:color="000000"/>
-              <w:left w:val="nil" w:sz="8" w:space="0" w:color="000000"/>
-              <w:bottom w:val="nil" w:sz="8" w:space="0" w:color="000000"/>
-              <w:right w:val="nil" w:sz="8" w:space="0" w:color="000000"/>
-              <w:insideH w:val="nil" w:sz="8" w:space="0" w:color="000000"/>
-              <w:insideV w:val="nil" w:sz="8" w:space="0" w:color="000000"/>
+              <w:top w:val="nil"/>
+              <w:left w:val="nil"/>
+              <w:bottom w:val="nil"/>
+              <w:right w:val="nil"/>
+              <w:insideH w:val="nil"/>
+              <w:insideV w:val="nil"/>
             </w:tcBorders>
+            <w:shd w:fill="FFFFFF"/>
           </w:tcPr>
           <w:p>
             <w:pPr>
-              <w:spacing w:before="80" w:after="80"/>
+              <w:spacing w:before="100" w:after="100" w:line="240" w:lineRule="auto"/>
               <w:jc w:val="center"/>
             </w:pPr>
             <w:r>
               <w:rPr>
-                <w:rFonts w:ascii="Times New Roman" w:hAnsi="Times New Roman" w:eastAsia="Times New Roman"/>
+                <w:rFonts w:ascii="Times New Roman" w:hAnsi="Times New Roman"/>
+                <w:b/>
+                <w:color w:val="000000"/>
+                <w:sz w:val="36"/>
+              </w:rPr>
+              <w:t>↓</w:t>
+              <w:br/>
+            </w:r>
+            <w:r>
+              <w:rPr>
+                <w:rFonts w:ascii="Times New Roman" w:hAnsi="Times New Roman"/>
+                <w:b w:val="0"/>
+                <w:color w:val="000000"/>
+                <w:sz w:val="21"/>
+              </w:rPr>
+              <w:t>100% ownership</w:t>
+            </w:r>
+          </w:p>
+        </w:tc>
+      </w:tr>
+      <w:tr>
+        <w:trPr>
+          <w:trHeight w:val="1181" w:hRule="atLeast"/>
+        </w:trPr>
+        <w:tc>
+          <w:tcPr>
+            <w:tcW w:type="dxa" w:w="7416"/>
+            <w:vAlign w:val="center"/>
+            <w:tcBorders>
+              <w:top w:val="single" w:sz="10" w:color="444444"/>
+              <w:left w:val="single" w:sz="10" w:color="444444"/>
+              <w:bottom w:val="single" w:sz="10" w:color="444444"/>
+              <w:right w:val="single" w:sz="10" w:color="444444"/>
+              <w:insideH w:val="single" w:sz="10" w:color="444444"/>
+              <w:insideV w:val="single" w:sz="10" w:color="444444"/>
+            </w:tcBorders>
+            <w:shd w:fill="F2F2F2"/>
+          </w:tcPr>
+          <w:p>
+            <w:pPr>
+              <w:spacing w:before="80" w:after="80" w:line="240" w:lineRule="auto"/>
+              <w:jc w:val="center"/>
+            </w:pPr>
+            <w:r>
+              <w:rPr>
+                <w:rFonts w:ascii="Times New Roman" w:hAnsi="Times New Roman"/>
+                <w:b/>
+                <w:color w:val="000000"/>
+                <w:sz w:val="21"/>
+              </w:rPr>
+              <w:t>Tyler operating company — to be formed</w:t>
+              <w:br/>
+            </w:r>
+            <w:r>
+              <w:rPr>
+                <w:rFonts w:ascii="Times New Roman" w:hAnsi="Times New Roman"/>
                 <w:b w:val="0"/>
                 <w:color w:val="000000"/>
                 <w:sz w:val="19"/>
               </w:rPr>
-              <w:t>→</w:t>
+              <w:t>Intended DBA: Azalea Hospice</w:t>
               <w:br/>
-              <w:t>100% ownership</w:t>
             </w:r>
-          </w:p>
-        </w:tc>
-        <w:tc>
-          <w:tcPr>
-            <w:tcW w:type="dxa" w:w="3120"/>
-            <w:vAlign w:val="center"/>
-            <w:shd w:fill="F2F2F2"/>
-            <w:tcBorders>
-              <w:top w:val="single" w:sz="8" w:space="0" w:color="000000"/>
-              <w:left w:val="single" w:sz="8" w:space="0" w:color="000000"/>
-              <w:bottom w:val="single" w:sz="8" w:space="0" w:color="000000"/>
-              <w:right w:val="single" w:sz="8" w:space="0" w:color="000000"/>
-            </w:tcBorders>
-          </w:tcPr>
-          <w:p>
-            <w:pPr>
-              <w:spacing w:before="80" w:after="80"/>
-              <w:jc w:val="center"/>
-            </w:pPr>
             <w:r>
               <w:rPr>
-                <w:rFonts w:ascii="Times New Roman" w:hAnsi="Times New Roman" w:eastAsia="Times New Roman"/>
-                <w:b/>
+                <w:rFonts w:ascii="Times New Roman" w:hAnsi="Times New Roman"/>
+                <w:b w:val="0"/>
                 <w:color w:val="000000"/>
-                <w:sz w:val="20"/>
+                <w:sz w:val="19"/>
               </w:rPr>
-              <w:t>Tyler operating company — to be formed</w:t>
-              <w:br/>
-              <w:t>Intended DBA: Azalea Hospice</w:t>
-              <w:br/>
               <w:t>Tyler, Texas operating entity</w:t>
             </w:r>
           </w:p>

</xml_diff>

<commit_message>
Finalize print-ready Profound memoranda
</commit_message>
<xml_diff>
--- a/sba_application/21_profound_ads_partnership_2026-08-06/Profound Counsel Memorandum - Working Draft Revision 1.00 - 080626.docx
+++ b/sba_application/21_profound_ads_partnership_2026-08-06/Profound Counsel Memorandum - Working Draft Revision 1.00 - 080626.docx
@@ -13,6 +13,9 @@
         <w:gridCol w:w="2700"/>
       </w:tblGrid>
       <w:tr>
+        <w:trPr>
+          <w:cantSplit w:val="true"/>
+        </w:trPr>
         <w:tc>
           <w:tcPr>
             <w:tcW w:type="dxa" w:w="2700"/>
@@ -29,6 +32,7 @@
           </w:tcPr>
           <w:p>
             <w:pPr>
+              <w:widowControl/>
               <w:spacing w:before="40" w:after="40"/>
               <w:jc w:val="center"/>
             </w:pPr>
@@ -47,6 +51,7 @@
     </w:tbl>
     <w:p>
       <w:pPr>
+        <w:widowControl/>
         <w:spacing w:before="200" w:after="40" w:line="252" w:lineRule="auto"/>
         <w:jc w:val="center"/>
       </w:pPr>
@@ -62,6 +67,7 @@
     </w:p>
     <w:p>
       <w:pPr>
+        <w:widowControl/>
         <w:spacing w:after="240" w:line="252" w:lineRule="auto"/>
         <w:jc w:val="center"/>
       </w:pPr>
@@ -78,6 +84,7 @@
     </w:p>
     <w:p>
       <w:pPr>
+        <w:widowControl/>
         <w:spacing w:after="0" w:line="252" w:lineRule="auto"/>
       </w:pPr>
       <w:r>
@@ -103,6 +110,7 @@
     </w:p>
     <w:p>
       <w:pPr>
+        <w:widowControl/>
         <w:spacing w:after="0" w:line="252" w:lineRule="auto"/>
       </w:pPr>
       <w:r>
@@ -128,6 +136,7 @@
     </w:p>
     <w:p>
       <w:pPr>
+        <w:widowControl/>
         <w:spacing w:after="0" w:line="252" w:lineRule="auto"/>
       </w:pPr>
       <w:r>
@@ -152,6 +161,7 @@
     </w:p>
     <w:p>
       <w:pPr>
+        <w:widowControl/>
         <w:spacing w:after="0" w:line="252" w:lineRule="auto"/>
       </w:pPr>
       <w:r>
@@ -177,6 +187,7 @@
     </w:p>
     <w:p>
       <w:pPr>
+        <w:widowControl/>
         <w:spacing w:after="0" w:line="252" w:lineRule="auto"/>
       </w:pPr>
       <w:r>
@@ -202,6 +213,7 @@
     </w:p>
     <w:p>
       <w:pPr>
+        <w:widowControl/>
         <w:spacing w:after="200" w:line="252" w:lineRule="auto"/>
       </w:pPr>
       <w:r>
@@ -227,6 +239,7 @@
     </w:p>
     <w:p>
       <w:pPr>
+        <w:widowControl/>
         <w:spacing w:after="200" w:line="252" w:lineRule="auto"/>
       </w:pPr>
     </w:p>
@@ -234,6 +247,7 @@
       <w:pPr>
         <w:spacing w:before="100" w:after="200" w:line="252" w:lineRule="auto"/>
         <w:ind w:left="202" w:right="144"/>
+        <w:widowControl/>
         <w:shd w:fill="FFFFFF" w:val="clear"/>
       </w:pPr>
       <w:r>
@@ -260,6 +274,9 @@
     <w:p>
       <w:pPr>
         <w:pStyle w:val="Heading1"/>
+        <w:keepNext/>
+        <w:keepLines/>
+        <w:widowControl/>
         <w:spacing w:line="252" w:lineRule="auto"/>
       </w:pPr>
       <w:r>
@@ -274,6 +291,7 @@
     </w:p>
     <w:p>
       <w:pPr>
+        <w:widowControl/>
         <w:spacing w:line="252" w:lineRule="auto"/>
       </w:pPr>
       <w:r>
@@ -289,6 +307,7 @@
     </w:p>
     <w:p>
       <w:pPr>
+        <w:widowControl/>
         <w:spacing w:line="252" w:lineRule="auto"/>
       </w:pPr>
       <w:r>
@@ -304,6 +323,7 @@
     </w:p>
     <w:p>
       <w:pPr>
+        <w:widowControl/>
         <w:spacing w:line="252" w:lineRule="auto"/>
       </w:pPr>
       <w:r>
@@ -320,6 +340,9 @@
     <w:p>
       <w:pPr>
         <w:pStyle w:val="Heading1"/>
+        <w:keepNext/>
+        <w:keepLines/>
+        <w:widowControl/>
         <w:spacing w:line="252" w:lineRule="auto"/>
       </w:pPr>
       <w:r>
@@ -336,6 +359,8 @@
       <w:pPr>
         <w:pStyle w:val="Heading2"/>
         <w:keepNext/>
+        <w:keepLines/>
+        <w:widowControl/>
         <w:spacing w:line="240" w:lineRule="auto" w:before="140" w:after="60"/>
         <w:ind/>
       </w:pPr>
@@ -351,6 +376,7 @@
     </w:p>
     <w:p>
       <w:pPr>
+        <w:widowControl/>
         <w:spacing w:line="252" w:lineRule="auto"/>
       </w:pPr>
       <w:r>
@@ -367,6 +393,7 @@
     <w:p>
       <w:pPr>
         <w:pStyle w:val="ListBullet"/>
+        <w:widowControl/>
         <w:spacing w:line="240" w:lineRule="auto" w:after="40"/>
         <w:ind w:left="864" w:hanging="360" w:right="216"/>
       </w:pPr>
@@ -384,6 +411,7 @@
     <w:p>
       <w:pPr>
         <w:pStyle w:val="ListBullet"/>
+        <w:widowControl/>
         <w:spacing w:line="240" w:lineRule="auto" w:after="40"/>
         <w:ind w:left="864" w:hanging="360" w:right="216"/>
       </w:pPr>
@@ -401,6 +429,7 @@
     <w:p>
       <w:pPr>
         <w:pStyle w:val="ListBullet"/>
+        <w:widowControl/>
         <w:spacing w:line="240" w:lineRule="auto" w:after="40"/>
         <w:ind w:left="864" w:hanging="360" w:right="216"/>
       </w:pPr>
@@ -418,6 +447,7 @@
     <w:p>
       <w:pPr>
         <w:pStyle w:val="ListBullet"/>
+        <w:widowControl/>
         <w:spacing w:line="240" w:lineRule="auto" w:after="40"/>
         <w:ind w:left="864" w:hanging="360" w:right="216"/>
       </w:pPr>
@@ -435,6 +465,7 @@
     <w:p>
       <w:pPr>
         <w:pStyle w:val="ListBullet"/>
+        <w:widowControl/>
         <w:spacing w:line="240" w:lineRule="auto" w:after="40"/>
         <w:ind w:left="864" w:hanging="360" w:right="216"/>
       </w:pPr>
@@ -452,6 +483,7 @@
     <w:p>
       <w:pPr>
         <w:pStyle w:val="ListBullet"/>
+        <w:widowControl/>
         <w:spacing w:line="240" w:lineRule="auto" w:after="40"/>
         <w:ind w:left="864" w:hanging="360" w:right="216"/>
       </w:pPr>
@@ -469,6 +501,7 @@
     <w:p>
       <w:pPr>
         <w:pStyle w:val="ListBullet"/>
+        <w:widowControl/>
         <w:spacing w:line="240" w:lineRule="auto" w:after="40"/>
         <w:ind w:left="864" w:hanging="360" w:right="216"/>
       </w:pPr>
@@ -485,6 +518,7 @@
     </w:p>
     <w:p>
       <w:pPr>
+        <w:widowControl/>
         <w:spacing w:line="252" w:lineRule="auto"/>
       </w:pPr>
       <w:r>
@@ -502,6 +536,8 @@
       <w:pPr>
         <w:pStyle w:val="Heading2"/>
         <w:keepNext/>
+        <w:keepLines/>
+        <w:widowControl/>
         <w:spacing w:line="240" w:lineRule="auto" w:before="140" w:after="60"/>
         <w:ind/>
       </w:pPr>
@@ -517,6 +553,7 @@
     </w:p>
     <w:p>
       <w:pPr>
+        <w:widowControl/>
         <w:spacing w:line="252" w:lineRule="auto"/>
       </w:pPr>
       <w:r>
@@ -532,6 +569,7 @@
     </w:p>
     <w:p>
       <w:pPr>
+        <w:widowControl/>
         <w:spacing w:line="252" w:lineRule="auto"/>
       </w:pPr>
       <w:r>
@@ -548,6 +586,9 @@
     <w:p>
       <w:pPr>
         <w:pStyle w:val="Heading1"/>
+        <w:keepNext/>
+        <w:keepLines/>
+        <w:widowControl/>
         <w:spacing w:line="252" w:lineRule="auto"/>
       </w:pPr>
       <w:r>
@@ -564,6 +605,7 @@
       <w:pPr>
         <w:spacing w:before="100" w:after="200" w:line="252" w:lineRule="auto"/>
         <w:ind w:left="202" w:right="144"/>
+        <w:widowControl/>
         <w:shd w:fill="FFFFFF" w:val="clear"/>
       </w:pPr>
       <w:r>
@@ -589,6 +631,7 @@
     </w:p>
     <w:p>
       <w:pPr>
+        <w:widowControl/>
         <w:spacing w:line="252" w:lineRule="auto"/>
       </w:pPr>
       <w:r>
@@ -604,6 +647,7 @@
     </w:p>
     <w:p>
       <w:pPr>
+        <w:widowControl/>
         <w:spacing w:line="252" w:lineRule="auto"/>
       </w:pPr>
       <w:r>
@@ -620,6 +664,7 @@
     <w:p>
       <w:pPr>
         <w:pStyle w:val="ListBullet"/>
+        <w:widowControl/>
         <w:spacing w:line="240" w:lineRule="auto" w:after="40"/>
         <w:ind w:left="864" w:hanging="360" w:right="216"/>
       </w:pPr>
@@ -637,6 +682,7 @@
     <w:p>
       <w:pPr>
         <w:pStyle w:val="ListBullet"/>
+        <w:widowControl/>
         <w:spacing w:line="240" w:lineRule="auto" w:after="40"/>
         <w:ind w:left="864" w:hanging="360" w:right="216"/>
       </w:pPr>
@@ -654,6 +700,7 @@
     <w:p>
       <w:pPr>
         <w:pStyle w:val="ListBullet"/>
+        <w:widowControl/>
         <w:spacing w:line="240" w:lineRule="auto" w:after="40"/>
         <w:ind w:left="864" w:hanging="360" w:right="216"/>
       </w:pPr>
@@ -671,6 +718,7 @@
     <w:p>
       <w:pPr>
         <w:pStyle w:val="ListBullet"/>
+        <w:widowControl/>
         <w:spacing w:line="240" w:lineRule="auto" w:after="40"/>
         <w:ind w:left="864" w:hanging="360" w:right="216"/>
       </w:pPr>
@@ -688,6 +736,7 @@
     <w:p>
       <w:pPr>
         <w:pStyle w:val="ListBullet"/>
+        <w:widowControl/>
         <w:spacing w:line="240" w:lineRule="auto" w:after="40"/>
         <w:ind w:left="864" w:hanging="360" w:right="216"/>
       </w:pPr>
@@ -705,6 +754,9 @@
     <w:p>
       <w:pPr>
         <w:pStyle w:val="Heading1"/>
+        <w:keepNext/>
+        <w:keepLines/>
+        <w:widowControl/>
         <w:spacing w:line="252" w:lineRule="auto"/>
       </w:pPr>
       <w:r>
@@ -721,6 +773,8 @@
       <w:pPr>
         <w:pStyle w:val="Heading2"/>
         <w:keepNext/>
+        <w:keepLines/>
+        <w:widowControl/>
         <w:spacing w:line="240" w:lineRule="auto" w:before="140" w:after="60"/>
         <w:ind/>
       </w:pPr>
@@ -736,6 +790,7 @@
     </w:p>
     <w:p>
       <w:pPr>
+        <w:widowControl/>
         <w:spacing w:line="252" w:lineRule="auto"/>
       </w:pPr>
       <w:r>
@@ -751,6 +806,7 @@
     </w:p>
     <w:p>
       <w:pPr>
+        <w:widowControl/>
         <w:spacing w:line="252" w:lineRule="auto"/>
       </w:pPr>
       <w:r>
@@ -766,6 +822,7 @@
     </w:p>
     <w:p>
       <w:pPr>
+        <w:widowControl/>
         <w:spacing w:line="252" w:lineRule="auto"/>
       </w:pPr>
       <w:r>
@@ -783,6 +840,8 @@
       <w:pPr>
         <w:pStyle w:val="Heading2"/>
         <w:keepNext/>
+        <w:keepLines/>
+        <w:widowControl/>
         <w:spacing w:line="240" w:lineRule="auto" w:before="140" w:after="60"/>
         <w:ind/>
       </w:pPr>
@@ -798,6 +857,7 @@
     </w:p>
     <w:p>
       <w:pPr>
+        <w:widowControl/>
         <w:spacing w:line="252" w:lineRule="auto"/>
       </w:pPr>
       <w:r>
@@ -815,6 +875,7 @@
       <w:pPr>
         <w:spacing w:after="160" w:line="252" w:lineRule="auto"/>
         <w:ind w:left="720" w:hanging="360"/>
+        <w:widowControl/>
         <w:numPr>
           <w:ilvl w:val="0"/>
           <w:numId w:val="10"/>
@@ -835,6 +896,7 @@
       <w:pPr>
         <w:spacing w:after="160" w:line="252" w:lineRule="auto"/>
         <w:ind w:left="720" w:hanging="360"/>
+        <w:widowControl/>
         <w:numPr>
           <w:ilvl w:val="0"/>
           <w:numId w:val="10"/>
@@ -854,6 +916,7 @@
     <w:p>
       <w:pPr>
         <w:pageBreakBefore w:val="0"/>
+        <w:widowControl/>
         <w:spacing w:line="252" w:lineRule="auto"/>
       </w:pPr>
       <w:r>
@@ -870,6 +933,9 @@
     <w:p>
       <w:pPr>
         <w:pStyle w:val="Heading1"/>
+        <w:keepNext/>
+        <w:keepLines/>
+        <w:widowControl/>
         <w:spacing w:line="252" w:lineRule="auto"/>
       </w:pPr>
       <w:r>
@@ -884,6 +950,7 @@
     </w:p>
     <w:p>
       <w:pPr>
+        <w:widowControl/>
         <w:spacing w:line="252" w:lineRule="auto"/>
       </w:pPr>
       <w:r>
@@ -900,6 +967,7 @@
     <w:p>
       <w:pPr>
         <w:pStyle w:val="ListBullet"/>
+        <w:widowControl/>
         <w:spacing w:line="240" w:lineRule="auto" w:after="40"/>
         <w:ind w:left="864" w:hanging="360" w:right="216"/>
       </w:pPr>
@@ -917,6 +985,7 @@
     <w:p>
       <w:pPr>
         <w:pStyle w:val="ListBullet"/>
+        <w:widowControl/>
         <w:spacing w:line="240" w:lineRule="auto" w:after="40"/>
         <w:ind w:left="864" w:hanging="360" w:right="216"/>
       </w:pPr>
@@ -934,6 +1003,7 @@
     <w:p>
       <w:pPr>
         <w:pStyle w:val="ListBullet"/>
+        <w:widowControl/>
         <w:spacing w:line="240" w:lineRule="auto" w:after="40"/>
         <w:ind w:left="864" w:hanging="360" w:right="216"/>
       </w:pPr>
@@ -951,6 +1021,7 @@
     <w:p>
       <w:pPr>
         <w:pStyle w:val="ListBullet"/>
+        <w:widowControl/>
         <w:spacing w:line="240" w:lineRule="auto" w:after="40"/>
         <w:ind w:left="864" w:hanging="360" w:right="216"/>
       </w:pPr>
@@ -968,6 +1039,7 @@
     <w:p>
       <w:pPr>
         <w:pStyle w:val="ListBullet"/>
+        <w:widowControl/>
         <w:spacing w:line="240" w:lineRule="auto" w:after="40"/>
         <w:ind w:left="864" w:hanging="360" w:right="216"/>
       </w:pPr>
@@ -985,6 +1057,7 @@
     <w:p>
       <w:pPr>
         <w:pStyle w:val="ListBullet"/>
+        <w:widowControl/>
         <w:spacing w:line="240" w:lineRule="auto" w:after="40"/>
         <w:ind w:left="864" w:hanging="360" w:right="216"/>
       </w:pPr>
@@ -1004,6 +1077,7 @@
         <w:spacing w:line="252" w:lineRule="auto" w:before="58" w:after="115"/>
         <w:ind w:left="216" w:right="115"/>
         <w:shd w:val="clear" w:color="auto" w:fill="F2F2F2"/>
+        <w:widowControl/>
         <w:pBdr>
           <w:left w:val="single" w:sz="8" w:space="6" w:color="A6A6A6"/>
         </w:pBdr>
@@ -1031,6 +1105,9 @@
     <w:p>
       <w:pPr>
         <w:pStyle w:val="Heading1"/>
+        <w:keepNext/>
+        <w:keepLines/>
+        <w:widowControl/>
         <w:spacing w:line="252" w:lineRule="auto"/>
       </w:pPr>
       <w:r>
@@ -1045,6 +1122,7 @@
     </w:p>
     <w:p>
       <w:pPr>
+        <w:widowControl/>
         <w:spacing w:line="252" w:lineRule="auto"/>
       </w:pPr>
       <w:r>
@@ -1060,6 +1138,7 @@
     </w:p>
     <w:p>
       <w:pPr>
+        <w:widowControl/>
         <w:spacing w:line="252" w:lineRule="auto"/>
       </w:pPr>
       <w:r>
@@ -1076,6 +1155,9 @@
     <w:p>
       <w:pPr>
         <w:pStyle w:val="Heading1"/>
+        <w:keepNext/>
+        <w:keepLines/>
+        <w:widowControl/>
         <w:spacing w:line="252" w:lineRule="auto"/>
       </w:pPr>
       <w:r>
@@ -1090,6 +1172,7 @@
     </w:p>
     <w:p>
       <w:pPr>
+        <w:widowControl/>
         <w:spacing w:line="252" w:lineRule="auto"/>
       </w:pPr>
       <w:r>
@@ -1106,6 +1189,7 @@
     <w:p>
       <w:pPr>
         <w:pStyle w:val="ListBullet"/>
+        <w:widowControl/>
         <w:spacing w:line="240" w:lineRule="auto" w:after="40"/>
         <w:ind w:left="864" w:hanging="360" w:right="216"/>
       </w:pPr>
@@ -1123,6 +1207,7 @@
     <w:p>
       <w:pPr>
         <w:pStyle w:val="ListBullet"/>
+        <w:widowControl/>
         <w:spacing w:line="240" w:lineRule="auto" w:after="40"/>
         <w:ind w:left="864" w:hanging="360" w:right="216"/>
       </w:pPr>
@@ -1140,6 +1225,7 @@
     <w:p>
       <w:pPr>
         <w:pStyle w:val="ListBullet"/>
+        <w:widowControl/>
         <w:spacing w:line="240" w:lineRule="auto" w:after="40"/>
         <w:ind w:left="864" w:hanging="360" w:right="216"/>
       </w:pPr>
@@ -1157,6 +1243,7 @@
     <w:p>
       <w:pPr>
         <w:pStyle w:val="ListBullet"/>
+        <w:widowControl/>
         <w:spacing w:line="240" w:lineRule="auto" w:after="40"/>
         <w:ind w:left="864" w:hanging="360" w:right="216"/>
       </w:pPr>
@@ -1174,6 +1261,7 @@
     <w:p>
       <w:pPr>
         <w:pStyle w:val="ListBullet"/>
+        <w:widowControl/>
         <w:spacing w:line="240" w:lineRule="auto" w:after="40"/>
         <w:ind w:left="864" w:hanging="360" w:right="216"/>
       </w:pPr>
@@ -1191,6 +1279,7 @@
     <w:p>
       <w:pPr>
         <w:pStyle w:val="ListBullet"/>
+        <w:widowControl/>
         <w:spacing w:line="240" w:lineRule="auto" w:after="40"/>
         <w:ind w:left="864" w:hanging="360" w:right="216"/>
       </w:pPr>
@@ -1207,6 +1296,7 @@
     </w:p>
     <w:p>
       <w:pPr>
+        <w:widowControl/>
         <w:spacing w:line="252" w:lineRule="auto"/>
       </w:pPr>
       <w:r>
@@ -1224,7 +1314,9 @@
       <w:pPr>
         <w:pStyle w:val="Heading2"/>
         <w:keepNext/>
+        <w:keepLines/>
         <w:pageBreakBefore/>
+        <w:widowControl/>
         <w:spacing w:before="140" w:after="60" w:line="240" w:lineRule="auto"/>
       </w:pPr>
       <w:r>
@@ -1240,8 +1332,9 @@
     <w:tbl>
       <w:tblPr>
         <w:tblStyle w:val="TableGrid"/>
-        <w:tblW w:type="auto" w:w="0"/>
+        <w:tblW w:type="dxa" w:w="9360"/>
         <w:jc w:val="center"/>
+        <w:tblLayout w:type="fixed"/>
         <w:tblLook w:firstColumn="1" w:firstRow="1" w:lastColumn="0" w:lastRow="0" w:noHBand="0" w:noVBand="1" w:val="04A0"/>
       </w:tblPr>
       <w:tblGrid>
@@ -1253,6 +1346,7 @@
       <w:tr>
         <w:trPr>
           <w:tblHeader w:val="true"/>
+          <w:cantSplit w:val="true"/>
         </w:trPr>
         <w:tc>
           <w:tcPr>
@@ -1260,6 +1354,7 @@
           </w:tcPr>
           <w:p>
             <w:pPr>
+              <w:widowControl/>
               <w:spacing w:before="0" w:after="0"/>
             </w:pPr>
             <w:r>
@@ -1279,6 +1374,7 @@
           </w:tcPr>
           <w:p>
             <w:pPr>
+              <w:widowControl/>
               <w:spacing w:before="0" w:after="0"/>
             </w:pPr>
             <w:r>
@@ -1298,6 +1394,7 @@
           </w:tcPr>
           <w:p>
             <w:pPr>
+              <w:widowControl/>
               <w:spacing w:before="0" w:after="0"/>
             </w:pPr>
             <w:r>
@@ -1317,6 +1414,7 @@
           </w:tcPr>
           <w:p>
             <w:pPr>
+              <w:widowControl/>
               <w:spacing w:before="0" w:after="0"/>
             </w:pPr>
             <w:r>
@@ -1332,12 +1430,16 @@
         </w:tc>
       </w:tr>
       <w:tr>
+        <w:trPr>
+          <w:cantSplit w:val="true"/>
+        </w:trPr>
         <w:tc>
           <w:tcPr>
             <w:tcW w:type="dxa" w:w="2340"/>
           </w:tcPr>
           <w:p>
             <w:pPr>
+              <w:widowControl/>
               <w:spacing w:before="0" w:after="0"/>
             </w:pPr>
             <w:r>
@@ -1356,6 +1458,7 @@
           </w:tcPr>
           <w:p>
             <w:pPr>
+              <w:widowControl/>
               <w:spacing w:before="0" w:after="0"/>
             </w:pPr>
             <w:r>
@@ -1374,6 +1477,7 @@
           </w:tcPr>
           <w:p>
             <w:pPr>
+              <w:widowControl/>
               <w:spacing w:before="0" w:after="0"/>
             </w:pPr>
             <w:r>
@@ -1392,6 +1496,7 @@
           </w:tcPr>
           <w:p>
             <w:pPr>
+              <w:widowControl/>
               <w:spacing w:before="0" w:after="0"/>
             </w:pPr>
             <w:r>
@@ -1406,12 +1511,16 @@
         </w:tc>
       </w:tr>
       <w:tr>
+        <w:trPr>
+          <w:cantSplit w:val="true"/>
+        </w:trPr>
         <w:tc>
           <w:tcPr>
             <w:tcW w:type="dxa" w:w="2340"/>
           </w:tcPr>
           <w:p>
             <w:pPr>
+              <w:widowControl/>
               <w:spacing w:before="0" w:after="0"/>
             </w:pPr>
             <w:r>
@@ -1430,6 +1539,7 @@
           </w:tcPr>
           <w:p>
             <w:pPr>
+              <w:widowControl/>
               <w:spacing w:before="0" w:after="0"/>
             </w:pPr>
             <w:r>
@@ -1448,6 +1558,7 @@
           </w:tcPr>
           <w:p>
             <w:pPr>
+              <w:widowControl/>
               <w:spacing w:before="0" w:after="0"/>
             </w:pPr>
             <w:r>
@@ -1466,6 +1577,7 @@
           </w:tcPr>
           <w:p>
             <w:pPr>
+              <w:widowControl/>
               <w:spacing w:before="0" w:after="0"/>
             </w:pPr>
             <w:r>
@@ -1480,12 +1592,16 @@
         </w:tc>
       </w:tr>
       <w:tr>
+        <w:trPr>
+          <w:cantSplit w:val="true"/>
+        </w:trPr>
         <w:tc>
           <w:tcPr>
             <w:tcW w:type="dxa" w:w="2340"/>
           </w:tcPr>
           <w:p>
             <w:pPr>
+              <w:widowControl/>
               <w:spacing w:before="0" w:after="0"/>
             </w:pPr>
             <w:r>
@@ -1504,6 +1620,7 @@
           </w:tcPr>
           <w:p>
             <w:pPr>
+              <w:widowControl/>
               <w:spacing w:before="0" w:after="0"/>
             </w:pPr>
             <w:r>
@@ -1522,6 +1639,7 @@
           </w:tcPr>
           <w:p>
             <w:pPr>
+              <w:widowControl/>
               <w:spacing w:before="0" w:after="0"/>
             </w:pPr>
             <w:r>
@@ -1540,6 +1658,7 @@
           </w:tcPr>
           <w:p>
             <w:pPr>
+              <w:widowControl/>
               <w:spacing w:before="0" w:after="0"/>
             </w:pPr>
             <w:r>
@@ -1554,12 +1673,16 @@
         </w:tc>
       </w:tr>
       <w:tr>
+        <w:trPr>
+          <w:cantSplit w:val="true"/>
+        </w:trPr>
         <w:tc>
           <w:tcPr>
             <w:tcW w:type="dxa" w:w="2340"/>
           </w:tcPr>
           <w:p>
             <w:pPr>
+              <w:widowControl/>
               <w:spacing w:before="0" w:after="0"/>
             </w:pPr>
             <w:r>
@@ -1578,6 +1701,7 @@
           </w:tcPr>
           <w:p>
             <w:pPr>
+              <w:widowControl/>
               <w:spacing w:before="0" w:after="0"/>
             </w:pPr>
             <w:r>
@@ -1596,6 +1720,7 @@
           </w:tcPr>
           <w:p>
             <w:pPr>
+              <w:widowControl/>
               <w:spacing w:before="0" w:after="0"/>
             </w:pPr>
             <w:r>
@@ -1614,6 +1739,7 @@
           </w:tcPr>
           <w:p>
             <w:pPr>
+              <w:widowControl/>
               <w:spacing w:before="0" w:after="0"/>
             </w:pPr>
             <w:r>
@@ -1628,12 +1754,16 @@
         </w:tc>
       </w:tr>
       <w:tr>
+        <w:trPr>
+          <w:cantSplit w:val="true"/>
+        </w:trPr>
         <w:tc>
           <w:tcPr>
             <w:tcW w:type="dxa" w:w="2340"/>
           </w:tcPr>
           <w:p>
             <w:pPr>
+              <w:widowControl/>
               <w:spacing w:before="0" w:after="0"/>
             </w:pPr>
             <w:r>
@@ -1652,6 +1782,7 @@
           </w:tcPr>
           <w:p>
             <w:pPr>
+              <w:widowControl/>
               <w:spacing w:before="0" w:after="0"/>
             </w:pPr>
             <w:r>
@@ -1670,6 +1801,7 @@
           </w:tcPr>
           <w:p>
             <w:pPr>
+              <w:widowControl/>
               <w:spacing w:before="0" w:after="0"/>
             </w:pPr>
             <w:r>
@@ -1688,6 +1820,7 @@
           </w:tcPr>
           <w:p>
             <w:pPr>
+              <w:widowControl/>
               <w:spacing w:before="0" w:after="0"/>
             </w:pPr>
             <w:r>
@@ -1702,12 +1835,16 @@
         </w:tc>
       </w:tr>
       <w:tr>
+        <w:trPr>
+          <w:cantSplit w:val="true"/>
+        </w:trPr>
         <w:tc>
           <w:tcPr>
             <w:tcW w:type="dxa" w:w="2340"/>
           </w:tcPr>
           <w:p>
             <w:pPr>
+              <w:widowControl/>
               <w:spacing w:before="0" w:after="0"/>
             </w:pPr>
             <w:r>
@@ -1726,6 +1863,7 @@
           </w:tcPr>
           <w:p>
             <w:pPr>
+              <w:widowControl/>
               <w:spacing w:before="0" w:after="0"/>
             </w:pPr>
             <w:r>
@@ -1744,6 +1882,7 @@
           </w:tcPr>
           <w:p>
             <w:pPr>
+              <w:widowControl/>
               <w:spacing w:before="0" w:after="0"/>
             </w:pPr>
             <w:r>
@@ -1762,6 +1901,7 @@
           </w:tcPr>
           <w:p>
             <w:pPr>
+              <w:widowControl/>
               <w:spacing w:before="0" w:after="0"/>
             </w:pPr>
             <w:r>
@@ -1776,12 +1916,16 @@
         </w:tc>
       </w:tr>
       <w:tr>
+        <w:trPr>
+          <w:cantSplit w:val="true"/>
+        </w:trPr>
         <w:tc>
           <w:tcPr>
             <w:tcW w:type="dxa" w:w="2340"/>
           </w:tcPr>
           <w:p>
             <w:pPr>
+              <w:widowControl/>
               <w:spacing w:before="0" w:after="0"/>
             </w:pPr>
             <w:r>
@@ -1800,6 +1944,7 @@
           </w:tcPr>
           <w:p>
             <w:pPr>
+              <w:widowControl/>
               <w:spacing w:before="0" w:after="0"/>
             </w:pPr>
             <w:r>
@@ -1818,6 +1963,7 @@
           </w:tcPr>
           <w:p>
             <w:pPr>
+              <w:widowControl/>
               <w:spacing w:before="0" w:after="0"/>
             </w:pPr>
             <w:r>
@@ -1836,6 +1982,7 @@
           </w:tcPr>
           <w:p>
             <w:pPr>
+              <w:widowControl/>
               <w:spacing w:before="0" w:after="0"/>
             </w:pPr>
             <w:r>
@@ -1850,12 +1997,16 @@
         </w:tc>
       </w:tr>
       <w:tr>
+        <w:trPr>
+          <w:cantSplit w:val="true"/>
+        </w:trPr>
         <w:tc>
           <w:tcPr>
             <w:tcW w:type="dxa" w:w="2340"/>
           </w:tcPr>
           <w:p>
             <w:pPr>
+              <w:widowControl/>
               <w:spacing w:before="0" w:after="0"/>
             </w:pPr>
             <w:r>
@@ -1874,6 +2025,7 @@
           </w:tcPr>
           <w:p>
             <w:pPr>
+              <w:widowControl/>
               <w:spacing w:before="0" w:after="0"/>
             </w:pPr>
             <w:r>
@@ -1892,6 +2044,7 @@
           </w:tcPr>
           <w:p>
             <w:pPr>
+              <w:widowControl/>
               <w:spacing w:before="0" w:after="0"/>
             </w:pPr>
             <w:r>
@@ -1910,6 +2063,7 @@
           </w:tcPr>
           <w:p>
             <w:pPr>
+              <w:widowControl/>
               <w:spacing w:before="0" w:after="0"/>
             </w:pPr>
             <w:r>
@@ -1927,6 +2081,9 @@
     <w:p>
       <w:pPr>
         <w:pStyle w:val="Heading1"/>
+        <w:keepNext/>
+        <w:keepLines/>
+        <w:widowControl/>
         <w:spacing w:line="252" w:lineRule="auto"/>
       </w:pPr>
       <w:r>
@@ -1941,6 +2098,7 @@
     </w:p>
     <w:p>
       <w:pPr>
+        <w:widowControl/>
         <w:spacing w:line="252" w:lineRule="auto"/>
       </w:pPr>
       <w:r>
@@ -1956,6 +2114,7 @@
     </w:p>
     <w:p>
       <w:pPr>
+        <w:widowControl/>
         <w:spacing w:line="252" w:lineRule="auto"/>
       </w:pPr>
       <w:r>
@@ -1972,6 +2131,9 @@
     <w:p>
       <w:pPr>
         <w:pStyle w:val="Heading1"/>
+        <w:keepNext/>
+        <w:keepLines/>
+        <w:widowControl/>
         <w:spacing w:line="252" w:lineRule="auto"/>
       </w:pPr>
       <w:r>
@@ -1986,6 +2148,7 @@
     </w:p>
     <w:p>
       <w:pPr>
+        <w:widowControl/>
         <w:spacing w:line="252" w:lineRule="auto"/>
       </w:pPr>
       <w:r>
@@ -2002,6 +2165,7 @@
     <w:p>
       <w:pPr>
         <w:pStyle w:val="ListNumber"/>
+        <w:widowControl/>
         <w:spacing w:line="240" w:lineRule="auto" w:after="40"/>
         <w:ind w:left="864" w:hanging="360" w:right="216"/>
       </w:pPr>
@@ -2019,6 +2183,7 @@
     <w:p>
       <w:pPr>
         <w:pStyle w:val="ListNumber"/>
+        <w:widowControl/>
         <w:spacing w:line="240" w:lineRule="auto" w:after="40"/>
         <w:ind w:left="864" w:hanging="360" w:right="216"/>
       </w:pPr>
@@ -2036,6 +2201,7 @@
     <w:p>
       <w:pPr>
         <w:pStyle w:val="ListNumber"/>
+        <w:widowControl/>
         <w:spacing w:line="240" w:lineRule="auto" w:after="40"/>
         <w:ind w:left="864" w:hanging="360" w:right="216"/>
       </w:pPr>
@@ -2053,6 +2219,7 @@
     <w:p>
       <w:pPr>
         <w:pStyle w:val="ListNumber"/>
+        <w:widowControl/>
         <w:spacing w:line="240" w:lineRule="auto" w:after="40"/>
         <w:ind w:left="864" w:hanging="360" w:right="216"/>
       </w:pPr>
@@ -2070,6 +2237,7 @@
     <w:p>
       <w:pPr>
         <w:pStyle w:val="ListNumber"/>
+        <w:widowControl/>
         <w:spacing w:line="240" w:lineRule="auto" w:after="40"/>
         <w:ind w:left="864" w:hanging="360" w:right="216"/>
       </w:pPr>
@@ -2087,6 +2255,7 @@
     <w:p>
       <w:pPr>
         <w:pStyle w:val="ListNumber"/>
+        <w:widowControl/>
         <w:spacing w:line="240" w:lineRule="auto" w:after="40"/>
         <w:ind w:left="864" w:hanging="360" w:right="216"/>
       </w:pPr>
@@ -2104,6 +2273,7 @@
     <w:p>
       <w:pPr>
         <w:pStyle w:val="ListNumber"/>
+        <w:widowControl/>
         <w:spacing w:line="240" w:lineRule="auto" w:after="40"/>
         <w:ind w:left="864" w:hanging="360" w:right="216"/>
       </w:pPr>
@@ -2121,6 +2291,7 @@
     <w:p>
       <w:pPr>
         <w:pStyle w:val="ListNumber"/>
+        <w:widowControl/>
         <w:spacing w:line="240" w:lineRule="auto" w:after="40"/>
         <w:ind w:left="864" w:hanging="360" w:right="216"/>
       </w:pPr>
@@ -2138,6 +2309,7 @@
     <w:p>
       <w:pPr>
         <w:pStyle w:val="ListNumber"/>
+        <w:widowControl/>
         <w:spacing w:line="240" w:lineRule="auto" w:after="40"/>
         <w:ind w:left="864" w:hanging="360" w:right="216"/>
       </w:pPr>
@@ -2155,6 +2327,7 @@
     <w:p>
       <w:pPr>
         <w:pStyle w:val="ListNumber"/>
+        <w:widowControl/>
         <w:spacing w:line="240" w:lineRule="auto" w:after="40"/>
         <w:ind w:left="864" w:hanging="360" w:right="216"/>
       </w:pPr>
@@ -2172,6 +2345,9 @@
     <w:p>
       <w:pPr>
         <w:pStyle w:val="Heading1"/>
+        <w:keepNext/>
+        <w:keepLines/>
+        <w:widowControl/>
         <w:spacing w:line="252" w:lineRule="auto"/>
       </w:pPr>
       <w:r>
@@ -2188,6 +2364,7 @@
       <w:pPr>
         <w:spacing w:after="160" w:line="252" w:lineRule="auto"/>
         <w:ind w:left="720" w:hanging="360"/>
+        <w:widowControl/>
         <w:numPr>
           <w:ilvl w:val="0"/>
           <w:numId w:val="11"/>
@@ -2208,6 +2385,7 @@
       <w:pPr>
         <w:spacing w:after="160" w:line="252" w:lineRule="auto"/>
         <w:ind w:left="720" w:hanging="360"/>
+        <w:widowControl/>
         <w:numPr>
           <w:ilvl w:val="0"/>
           <w:numId w:val="11"/>
@@ -2228,6 +2406,7 @@
       <w:pPr>
         <w:spacing w:after="160" w:line="252" w:lineRule="auto"/>
         <w:ind w:left="720" w:hanging="360"/>
+        <w:widowControl/>
         <w:numPr>
           <w:ilvl w:val="0"/>
           <w:numId w:val="11"/>
@@ -2248,6 +2427,7 @@
       <w:pPr>
         <w:spacing w:after="160" w:line="252" w:lineRule="auto"/>
         <w:ind w:left="720" w:hanging="360"/>
+        <w:widowControl/>
         <w:numPr>
           <w:ilvl w:val="0"/>
           <w:numId w:val="11"/>
@@ -2268,6 +2448,7 @@
       <w:pPr>
         <w:spacing w:after="160" w:line="252" w:lineRule="auto"/>
         <w:ind w:left="720" w:hanging="360"/>
+        <w:widowControl/>
         <w:numPr>
           <w:ilvl w:val="0"/>
           <w:numId w:val="11"/>
@@ -2288,6 +2469,7 @@
       <w:pPr>
         <w:spacing w:after="160" w:line="252" w:lineRule="auto"/>
         <w:ind w:left="720" w:hanging="360"/>
+        <w:widowControl/>
         <w:numPr>
           <w:ilvl w:val="0"/>
           <w:numId w:val="11"/>
@@ -2308,6 +2490,7 @@
       <w:pPr>
         <w:spacing w:after="160" w:line="252" w:lineRule="auto"/>
         <w:ind w:left="720" w:hanging="360"/>
+        <w:widowControl/>
         <w:numPr>
           <w:ilvl w:val="0"/>
           <w:numId w:val="11"/>
@@ -2328,6 +2511,7 @@
       <w:pPr>
         <w:spacing w:after="160" w:line="252" w:lineRule="auto"/>
         <w:ind w:left="720" w:hanging="360"/>
+        <w:widowControl/>
         <w:numPr>
           <w:ilvl w:val="0"/>
           <w:numId w:val="11"/>
@@ -2348,6 +2532,7 @@
       <w:pPr>
         <w:spacing w:after="160" w:line="252" w:lineRule="auto"/>
         <w:ind w:left="720" w:hanging="360"/>
+        <w:widowControl/>
         <w:numPr>
           <w:ilvl w:val="0"/>
           <w:numId w:val="11"/>
@@ -2368,6 +2553,7 @@
       <w:pPr>
         <w:spacing w:after="160" w:line="252" w:lineRule="auto"/>
         <w:ind w:left="720" w:hanging="360"/>
+        <w:widowControl/>
         <w:numPr>
           <w:ilvl w:val="0"/>
           <w:numId w:val="11"/>
@@ -2388,6 +2574,7 @@
       <w:pPr>
         <w:spacing w:after="160" w:line="252" w:lineRule="auto"/>
         <w:ind w:left="720" w:hanging="360"/>
+        <w:widowControl/>
         <w:numPr>
           <w:ilvl w:val="0"/>
           <w:numId w:val="11"/>
@@ -2408,6 +2595,7 @@
       <w:pPr>
         <w:spacing w:after="160" w:line="252" w:lineRule="auto"/>
         <w:ind w:left="720" w:hanging="360"/>
+        <w:widowControl/>
         <w:numPr>
           <w:ilvl w:val="0"/>
           <w:numId w:val="11"/>
@@ -2427,6 +2615,9 @@
     <w:p>
       <w:pPr>
         <w:pStyle w:val="Heading1"/>
+        <w:keepNext/>
+        <w:keepLines/>
+        <w:widowControl/>
         <w:spacing w:line="252" w:lineRule="auto"/>
       </w:pPr>
       <w:r>
@@ -2480,6 +2671,7 @@
           </w:tcPr>
           <w:p>
             <w:pPr>
+              <w:widowControl/>
               <w:spacing w:after="40" w:before="0" w:line="240" w:lineRule="auto"/>
             </w:pPr>
             <w:r>
@@ -2516,6 +2708,7 @@
           </w:tcPr>
           <w:p>
             <w:pPr>
+              <w:widowControl/>
               <w:spacing w:after="40" w:before="0" w:line="240" w:lineRule="auto"/>
             </w:pPr>
             <w:r>
@@ -2558,6 +2751,7 @@
           </w:tcPr>
           <w:p>
             <w:pPr>
+              <w:widowControl/>
               <w:spacing w:before="0" w:after="40" w:line="240" w:lineRule="auto"/>
             </w:pPr>
             <w:r>
@@ -2594,6 +2788,7 @@
           </w:tcPr>
           <w:p>
             <w:pPr>
+              <w:widowControl/>
               <w:spacing w:before="0" w:after="40" w:line="240" w:lineRule="auto"/>
             </w:pPr>
             <w:r>
@@ -2636,6 +2831,7 @@
           </w:tcPr>
           <w:p>
             <w:pPr>
+              <w:widowControl/>
               <w:spacing w:before="0" w:after="40" w:line="240" w:lineRule="auto"/>
             </w:pPr>
             <w:r>
@@ -2672,6 +2868,7 @@
           </w:tcPr>
           <w:p>
             <w:pPr>
+              <w:widowControl/>
               <w:spacing w:before="0" w:after="40" w:line="240" w:lineRule="auto"/>
             </w:pPr>
             <w:r>
@@ -2714,6 +2911,7 @@
           </w:tcPr>
           <w:p>
             <w:pPr>
+              <w:widowControl/>
               <w:spacing w:before="0" w:after="40" w:line="240" w:lineRule="auto"/>
             </w:pPr>
             <w:r>
@@ -2750,6 +2948,7 @@
           </w:tcPr>
           <w:p>
             <w:pPr>
+              <w:widowControl/>
               <w:spacing w:before="0" w:after="40" w:line="240" w:lineRule="auto"/>
             </w:pPr>
             <w:r>
@@ -2792,6 +2991,7 @@
           </w:tcPr>
           <w:p>
             <w:pPr>
+              <w:widowControl/>
               <w:spacing w:before="0" w:after="40" w:line="240" w:lineRule="auto"/>
             </w:pPr>
             <w:r>
@@ -2828,6 +3028,7 @@
           </w:tcPr>
           <w:p>
             <w:pPr>
+              <w:widowControl/>
               <w:spacing w:before="0" w:after="40" w:line="240" w:lineRule="auto"/>
             </w:pPr>
             <w:r>
@@ -2870,6 +3071,7 @@
           </w:tcPr>
           <w:p>
             <w:pPr>
+              <w:widowControl/>
               <w:spacing w:before="0" w:after="40" w:line="240" w:lineRule="auto"/>
             </w:pPr>
             <w:r>
@@ -2906,6 +3108,7 @@
           </w:tcPr>
           <w:p>
             <w:pPr>
+              <w:widowControl/>
               <w:spacing w:before="0" w:after="40" w:line="240" w:lineRule="auto"/>
             </w:pPr>
             <w:r>
@@ -2948,6 +3151,7 @@
           </w:tcPr>
           <w:p>
             <w:pPr>
+              <w:widowControl/>
               <w:spacing w:before="0" w:after="40" w:line="240" w:lineRule="auto"/>
             </w:pPr>
             <w:r>
@@ -2984,6 +3188,7 @@
           </w:tcPr>
           <w:p>
             <w:pPr>
+              <w:widowControl/>
               <w:spacing w:before="0" w:after="40" w:line="240" w:lineRule="auto"/>
             </w:pPr>
             <w:r>
@@ -3003,6 +3208,9 @@
     <w:p>
       <w:pPr>
         <w:pStyle w:val="Heading1"/>
+        <w:keepNext/>
+        <w:keepLines/>
+        <w:widowControl/>
         <w:spacing w:line="252" w:lineRule="auto"/>
       </w:pPr>
       <w:r>
@@ -3017,6 +3225,7 @@
     </w:p>
     <w:p>
       <w:pPr>
+        <w:widowControl/>
         <w:spacing w:line="252" w:lineRule="auto"/>
       </w:pPr>
       <w:r>
@@ -3034,6 +3243,7 @@
       <w:pPr>
         <w:spacing w:before="100" w:after="200" w:line="252" w:lineRule="auto"/>
         <w:ind w:left="202" w:right="144"/>
+        <w:widowControl/>
         <w:shd w:fill="FFFFFF" w:val="clear"/>
       </w:pPr>
       <w:r>
@@ -3061,7 +3271,9 @@
       <w:pPr>
         <w:pStyle w:val="Heading1"/>
         <w:keepNext/>
+        <w:keepLines/>
         <w:pageBreakBefore/>
+        <w:widowControl/>
         <w:spacing w:line="252" w:lineRule="auto"/>
       </w:pPr>
       <w:r>
@@ -3077,6 +3289,7 @@
     <w:p>
       <w:pPr>
         <w:pStyle w:val="SourceText"/>
+        <w:widowControl/>
         <w:spacing w:line="252" w:lineRule="auto"/>
       </w:pPr>
       <w:hyperlink r:id="rId13">
@@ -3094,6 +3307,7 @@
     <w:p>
       <w:pPr>
         <w:pStyle w:val="SourceText"/>
+        <w:widowControl/>
         <w:spacing w:line="252" w:lineRule="auto"/>
       </w:pPr>
       <w:hyperlink r:id="rId14">
@@ -3111,6 +3325,7 @@
     <w:p>
       <w:pPr>
         <w:pStyle w:val="SourceText"/>
+        <w:widowControl/>
         <w:spacing w:line="252" w:lineRule="auto"/>
       </w:pPr>
       <w:hyperlink r:id="rId15">
@@ -3128,6 +3343,7 @@
     <w:p>
       <w:pPr>
         <w:pStyle w:val="SourceText"/>
+        <w:widowControl/>
         <w:spacing w:line="252" w:lineRule="auto"/>
       </w:pPr>
       <w:hyperlink r:id="rId16">
@@ -3145,6 +3361,7 @@
     <w:p>
       <w:pPr>
         <w:pStyle w:val="SourceText"/>
+        <w:widowControl/>
         <w:spacing w:line="252" w:lineRule="auto"/>
       </w:pPr>
       <w:hyperlink r:id="rId17">
@@ -3162,6 +3379,7 @@
     <w:p>
       <w:pPr>
         <w:pStyle w:val="SourceText"/>
+        <w:widowControl/>
         <w:spacing w:line="252" w:lineRule="auto"/>
       </w:pPr>
       <w:hyperlink r:id="rId18">
@@ -3179,6 +3397,7 @@
     <w:p>
       <w:pPr>
         <w:pStyle w:val="SourceText"/>
+        <w:widowControl/>
         <w:spacing w:line="252" w:lineRule="auto"/>
       </w:pPr>
       <w:hyperlink r:id="rId19">
@@ -3196,6 +3415,7 @@
     <w:p>
       <w:pPr>
         <w:pStyle w:val="SourceText"/>
+        <w:widowControl/>
         <w:spacing w:line="252" w:lineRule="auto"/>
       </w:pPr>
       <w:hyperlink r:id="rId20">
@@ -3214,7 +3434,9 @@
       <w:pPr>
         <w:pStyle w:val="Heading1"/>
         <w:keepNext/>
+        <w:keepLines/>
         <w:pageBreakBefore/>
+        <w:widowControl/>
         <w:spacing w:line="252" w:lineRule="auto"/>
       </w:pPr>
       <w:r>
@@ -3240,6 +3462,7 @@
       <w:tr>
         <w:trPr>
           <w:trHeight w:val="893" w:hRule="atLeast"/>
+          <w:cantSplit w:val="true"/>
         </w:trPr>
         <w:tc>
           <w:tcPr>
@@ -3257,6 +3480,7 @@
           </w:tcPr>
           <w:p>
             <w:pPr>
+              <w:widowControl/>
               <w:spacing w:before="80" w:after="80" w:line="240" w:lineRule="auto"/>
               <w:jc w:val="center"/>
             </w:pPr>
@@ -3285,6 +3509,7 @@
       <w:tr>
         <w:trPr>
           <w:trHeight w:val="893" w:hRule="atLeast"/>
+          <w:cantSplit w:val="true"/>
         </w:trPr>
         <w:tc>
           <w:tcPr>
@@ -3302,6 +3527,7 @@
           </w:tcPr>
           <w:p>
             <w:pPr>
+              <w:widowControl/>
               <w:spacing w:before="100" w:after="100" w:line="240" w:lineRule="auto"/>
               <w:jc w:val="center"/>
             </w:pPr>
@@ -3330,6 +3556,7 @@
       <w:tr>
         <w:trPr>
           <w:trHeight w:val="1181" w:hRule="atLeast"/>
+          <w:cantSplit w:val="true"/>
         </w:trPr>
         <w:tc>
           <w:tcPr>
@@ -3347,6 +3574,7 @@
           </w:tcPr>
           <w:p>
             <w:pPr>
+              <w:widowControl/>
               <w:spacing w:before="80" w:after="80" w:line="240" w:lineRule="auto"/>
               <w:jc w:val="center"/>
             </w:pPr>
@@ -3385,6 +3613,7 @@
     </w:tbl>
     <w:p>
       <w:pPr>
+        <w:widowControl/>
         <w:spacing w:before="160" w:after="0"/>
       </w:pPr>
       <w:r>

</xml_diff>